<commit_message>
Afegir rol nou-incorporat: nous professionals cobreixen Dc 16-20 en rotació
- planning_generator.py: nova cua separada per nou-incorporats a Config; algorisme prioritza aquesta cua per als torns de dimecres 16-20 (excepte 1r Dc del mes)
- validate_planning: nova validació que assegura nou-incorporats només al seu torn
- app.py: mostra els nou-incorporats a l'expander de configuració detectada
- 02_Plantilla_Entrada.xlsx: opció 'nou-incorporat' afegida a la validació del camp Rol + notes a Instruccions i Radiòlegs
- 01_Regles_Procés.docx: v2.1 amb el nou rol documentat
- EXEMPLE + Benchmark: mostra 2 nou-incorporats de demo (Novell-Nou1, Novell-Nou2)
- README: nova secció explicativa
</commit_message>
<xml_diff>
--- a/01_Regles_Procés.docx
+++ b/01_Regles_Procés.docx
@@ -17,7 +17,7 @@
     </w:p>
     <w:p>
       <w:r>
-        <w:t>Versió 2.0 — config-driven, sense dades identificatives al text.</w:t>
+        <w:t>Versió 2.1 — inclou el rol "nou-incorporat".</w:t>
       </w:r>
     </w:p>
     <w:p>
@@ -54,7 +54,7 @@
         <w:pStyle w:val="ListBullet"/>
       </w:pPr>
       <w:r>
-        <w:t>"Vacances": per a cada professional i dia del mes, codi V/C/G/X si aplica. A la fila 1 hi van les metadades del mes (mes/any, primer radiòleg de la roda, festius).</w:t>
+        <w:t>"Vacances": per a cada professional i dia del mes, codi V/C/G/X si aplica.</w:t>
       </w:r>
     </w:p>
     <w:p>
@@ -238,7 +238,7 @@
         <w:t xml:space="preserve">fix-i-rota: </w:t>
       </w:r>
       <w:r>
-        <w:t>Té torns fixos PERÒ també participa a la roda. La seva guàrdia de rotació és addicional als seus fixos.</w:t>
+        <w:t>Té torns fixos PERÒ també participa a la roda. La guàrdia rotatòria és addicional als seus fixos.</w:t>
       </w:r>
     </w:p>
     <w:p>
@@ -252,7 +252,7 @@
         <w:t xml:space="preserve">sun-nit-only: </w:t>
       </w:r>
       <w:r>
-        <w:t>Només fa guàrdies de diumenge nit. Participa a la roda; quan li toca, es col·loca al següent diumenge nit lliure.</w:t>
+        <w:t>Només fa guàrdies de diumenge nit. Participa a la roda; quan li toca, es col·loca al següent Dg nit lliure.</w:t>
       </w:r>
     </w:p>
     <w:p>
@@ -267,6 +267,20 @@
       </w:r>
       <w:r>
         <w:t>Només fa guàrdies de dissabte o diumenge de dia. Participa a la roda; quan li toca, va al següent Ds/Dg dia lliure.</w:t>
+      </w:r>
+    </w:p>
+    <w:p>
+      <w:pPr>
+        <w:pStyle w:val="ListBullet"/>
+      </w:pPr>
+      <w:r>
+        <w:rPr>
+          <w:b/>
+        </w:rPr>
+        <w:t xml:space="preserve">nou-incorporat: </w:t>
+      </w:r>
+      <w:r>
+        <w:t>Professional nou en període de rodatge. Cobreix EXCLUSIVAMENT els dimecres 16-20 (excepte el 1r Dc del mes, que és fix). Si hi ha diversos nou-incorporats, es rota entre ells. Quan el professional es considera format, se li canvia el rol a "rotador" i entra a la roda general.</w:t>
       </w:r>
     </w:p>
     <w:p>
@@ -512,7 +526,7 @@
           </w:tcPr>
           <w:p>
             <w:r>
-              <w:t>Un sol fix cobreix Neuro i Body (només el primer dimecres del mes)</w:t>
+              <w:t>Un sol fix (només el primer dimecres del mes)</w:t>
             </w:r>
           </w:p>
         </w:tc>
@@ -582,17 +596,6 @@
         </w:tc>
       </w:tr>
     </w:tbl>
-    <w:p>
-      <w:r>
-        <w:rPr>
-          <w:b/>
-        </w:rPr>
-        <w:t xml:space="preserve">Nota: </w:t>
-      </w:r>
-      <w:r>
-        <w:t>Si un professional fix té V/C/G en un dia concret, el sistema marca el torn com "a substituir". La substitució no és automàtica al codi — la tècnica ha de revisar i editar el planning generat per definir el substitut.</w:t>
-      </w:r>
-    </w:p>
     <w:p>
       <w:pPr>
         <w:pStyle w:val="Heading1"/>
@@ -671,7 +674,7 @@
           </w:tcPr>
           <w:p>
             <w:r>
-              <w:t>1 radiòleg cobreix Neuro i Body</w:t>
+              <w:t>1 radiòleg N i B</w:t>
             </w:r>
           </w:p>
         </w:tc>
@@ -703,7 +706,7 @@
           </w:tcPr>
           <w:p>
             <w:r>
-              <w:t>1 radiòleg cobreix Neuro i Body</w:t>
+              <w:t>1 radiòleg. **PRIORITAT: nou-incorporats.** Si no n'hi ha o no estan disponibles, roda alfabètica.</w:t>
             </w:r>
           </w:p>
         </w:tc>
@@ -735,7 +738,7 @@
           </w:tcPr>
           <w:p>
             <w:r>
-              <w:t>2 radiòlegs: Grup 1 i Grup 2</w:t>
+              <w:t>Grup 1 + Grup 2</w:t>
             </w:r>
           </w:p>
         </w:tc>
@@ -767,7 +770,7 @@
           </w:tcPr>
           <w:p>
             <w:r>
-              <w:t>2 radiòlegs: Grup 1 i Grup 2</w:t>
+              <w:t>Grup 1 + Grup 2</w:t>
             </w:r>
           </w:p>
         </w:tc>
@@ -779,7 +782,7 @@
           </w:tcPr>
           <w:p>
             <w:r>
-              <w:t>Dissabte</w:t>
+              <w:t>Dissabte dia (8-20)</w:t>
             </w:r>
           </w:p>
         </w:tc>
@@ -788,9 +791,7 @@
             <w:tcW w:type="dxa" w:w="2880"/>
           </w:tcPr>
           <w:p>
-            <w:r>
-              <w:t>8:00-20:00 (dia)</w:t>
-            </w:r>
+            <w:r/>
           </w:p>
         </w:tc>
         <w:tc>
@@ -799,7 +800,7 @@
           </w:tcPr>
           <w:p>
             <w:r>
-              <w:t>2 radiòlegs: Grup 1 i Grup 2</w:t>
+              <w:t>Grup 1 + Grup 2</w:t>
             </w:r>
           </w:p>
         </w:tc>
@@ -811,7 +812,7 @@
           </w:tcPr>
           <w:p>
             <w:r>
-              <w:t>Dissabte</w:t>
+              <w:t>Dissabte nit (20-08)</w:t>
             </w:r>
           </w:p>
         </w:tc>
@@ -820,9 +821,7 @@
             <w:tcW w:type="dxa" w:w="2880"/>
           </w:tcPr>
           <w:p>
-            <w:r>
-              <w:t>20:00-08:00 (nit)</w:t>
-            </w:r>
+            <w:r/>
           </w:p>
         </w:tc>
         <w:tc>
@@ -831,7 +830,7 @@
           </w:tcPr>
           <w:p>
             <w:r>
-              <w:t>2 radiòlegs: Grup 1 i Grup 2</w:t>
+              <w:t>Grup 1 + Grup 2</w:t>
             </w:r>
           </w:p>
         </w:tc>
@@ -843,7 +842,7 @@
           </w:tcPr>
           <w:p>
             <w:r>
-              <w:t>Diumenge</w:t>
+              <w:t>Diumenge dia</w:t>
             </w:r>
           </w:p>
         </w:tc>
@@ -853,7 +852,7 @@
           </w:tcPr>
           <w:p>
             <w:r>
-              <w:t>8:00-20:00 (dia)</w:t>
+              <w:t>8:00-20:00</w:t>
             </w:r>
           </w:p>
         </w:tc>
@@ -863,7 +862,7 @@
           </w:tcPr>
           <w:p>
             <w:r>
-              <w:t>1 radiòleg cobreix Neuro i Body</w:t>
+              <w:t>1 radiòleg</w:t>
             </w:r>
           </w:p>
         </w:tc>
@@ -875,7 +874,7 @@
           </w:tcPr>
           <w:p>
             <w:r>
-              <w:t>Diumenge</w:t>
+              <w:t>Diumenge nit</w:t>
             </w:r>
           </w:p>
         </w:tc>
@@ -885,7 +884,7 @@
           </w:tcPr>
           <w:p>
             <w:r>
-              <w:t>20:00-08:00 (nit)</w:t>
+              <w:t>20:00-08:00</w:t>
             </w:r>
           </w:p>
         </w:tc>
@@ -895,7 +894,7 @@
           </w:tcPr>
           <w:p>
             <w:r>
-              <w:t>1 radiòleg (vegeu §6 — perfils especials)</w:t>
+              <w:t>1 radiòleg (vegeu §6 — sun-nit-only)</w:t>
             </w:r>
           </w:p>
         </w:tc>
@@ -917,7 +916,7 @@
           </w:tcPr>
           <w:p>
             <w:r>
-              <w:t>8:00-20:00 (dia)</w:t>
+              <w:t>8-20 + 20-8</w:t>
             </w:r>
           </w:p>
         </w:tc>
@@ -927,39 +926,7 @@
           </w:tcPr>
           <w:p>
             <w:r>
-              <w:t>1 radiòleg cobreix Neuro i Body</w:t>
-            </w:r>
-          </w:p>
-        </w:tc>
-      </w:tr>
-      <w:tr>
-        <w:tc>
-          <w:tcPr>
-            <w:tcW w:type="dxa" w:w="2880"/>
-          </w:tcPr>
-          <w:p>
-            <w:r>
-              <w:t>Festiu Dl-Dc</w:t>
-            </w:r>
-          </w:p>
-        </w:tc>
-        <w:tc>
-          <w:tcPr>
-            <w:tcW w:type="dxa" w:w="2880"/>
-          </w:tcPr>
-          <w:p>
-            <w:r>
-              <w:t>20:00-08:00 (nit)</w:t>
-            </w:r>
-          </w:p>
-        </w:tc>
-        <w:tc>
-          <w:tcPr>
-            <w:tcW w:type="dxa" w:w="2880"/>
-          </w:tcPr>
-          <w:p>
-            <w:r>
-              <w:t>1 radiòleg cobreix Neuro i Body</w:t>
+              <w:t>1 radiòleg dia + 1 radiòleg nit</w:t>
             </w:r>
           </w:p>
         </w:tc>
@@ -981,7 +948,7 @@
           </w:tcPr>
           <w:p>
             <w:r>
-              <w:t>8:00-20:00 (dia)</w:t>
+              <w:t>8-20 + 20-8</w:t>
             </w:r>
           </w:p>
         </w:tc>
@@ -991,39 +958,7 @@
           </w:tcPr>
           <w:p>
             <w:r>
-              <w:t>2 radiòlegs: Grup 1 i Grup 2</w:t>
-            </w:r>
-          </w:p>
-        </w:tc>
-      </w:tr>
-      <w:tr>
-        <w:tc>
-          <w:tcPr>
-            <w:tcW w:type="dxa" w:w="2880"/>
-          </w:tcPr>
-          <w:p>
-            <w:r>
-              <w:t>Festiu Dj-Dv</w:t>
-            </w:r>
-          </w:p>
-        </w:tc>
-        <w:tc>
-          <w:tcPr>
-            <w:tcW w:type="dxa" w:w="2880"/>
-          </w:tcPr>
-          <w:p>
-            <w:r>
-              <w:t>20:00-08:00 (nit)</w:t>
-            </w:r>
-          </w:p>
-        </w:tc>
-        <w:tc>
-          <w:tcPr>
-            <w:tcW w:type="dxa" w:w="2880"/>
-          </w:tcPr>
-          <w:p>
-            <w:r>
-              <w:t>2 radiòlegs: Grup 1 i Grup 2</w:t>
+              <w:t>Grup 1 + Grup 2 (dia i nit cadascun)</w:t>
             </w:r>
           </w:p>
         </w:tc>
@@ -1045,7 +980,7 @@
         <w:t xml:space="preserve">sun-nit-only: </w:t>
       </w:r>
       <w:r>
-        <w:t>Quan a la roda alfabètica el seu nom apareix al davant de la cua, es desplaça la seva guàrdia al següent diumenge nit lliure. En conseqüència, el cicle de la roda determina quants Dg nit fa al mes (típicament 1-2).</w:t>
+        <w:t>Quan a la roda alfabètica el seu nom apareix al davant de la cua, es desplaça la seva guàrdia al següent diumenge nit lliure.</w:t>
       </w:r>
     </w:p>
     <w:p>
@@ -1056,7 +991,7 @@
         <w:t xml:space="preserve">weekend-day-only: </w:t>
       </w:r>
       <w:r>
-        <w:t>Mateixa lògica però amb el següent dissabte o diumenge de dia lliure.</w:t>
+        <w:t>Mateixa lògica amb el següent dissabte/diumenge de dia lliure.</w:t>
       </w:r>
     </w:p>
     <w:p>
@@ -1067,7 +1002,18 @@
         <w:t xml:space="preserve">fix-i-rota: </w:t>
       </w:r>
       <w:r>
-        <w:t>Té torns fixos a Configuració i a més participa a la roda. La seva guàrdia rotatòria és UNA, addicional als seus fixos. L'algorisme garanteix que no se li assigni un torn rotatori el mateix dia que ja té un fix.</w:t>
+        <w:t>Té torns fixos a Configuració i a més participa a la roda. La guàrdia rotatòria és UNA, addicional.</w:t>
+      </w:r>
+    </w:p>
+    <w:p>
+      <w:r>
+        <w:rPr>
+          <w:b/>
+        </w:rPr>
+        <w:t xml:space="preserve">nou-incorporat: </w:t>
+      </w:r>
+      <w:r>
+        <w:t>Té una cua separada, exclusiva per als dimecres 16-20 (excepte el 1r Dc del mes). Es rota entre els nou-incorporats. Si en un dimecres cap nou-incorporat no està disponible (V/C/G), aquell dimecres cau a la roda general. Aquests professionals NO apareixen a la roda alfabètica general.</w:t>
       </w:r>
     </w:p>
     <w:p>
@@ -1089,7 +1035,7 @@
         <w:t xml:space="preserve">Ordenació. </w:t>
       </w:r>
       <w:r>
-        <w:t>Tots els rotadors s'ordenen alfabèticament ignorant accents (convenció catalana/castellana).</w:t>
+        <w:t>Els rotadors s'ordenen alfabèticament ignorant accents.</w:t>
       </w:r>
     </w:p>
     <w:p>
@@ -1103,7 +1049,7 @@
         <w:t xml:space="preserve">Punt de partida. </w:t>
       </w:r>
       <w:r>
-        <w:t>La cua es rota perquè comenci pel professional indicat com a "Primer radiòleg" a la fila 1 de Vacances. Aquest professional és el següent alfabèticament al darrer que va tancar la roda del mes anterior.</w:t>
+        <w:t>La cua es rota perquè comenci pel professional indicat a la fila 1 de Vacances.</w:t>
       </w:r>
     </w:p>
     <w:p>
@@ -1117,7 +1063,7 @@
         <w:t xml:space="preserve">Iteració cronològica. </w:t>
       </w:r>
       <w:r>
-        <w:t>Es recorren els torns en ordre cronològic (dia 1 → dia N). Per a cada torn que cal omplir per roda:</w:t>
+        <w:t>Es recorren els torns en ordre. Per a cada torn:</w:t>
       </w:r>
     </w:p>
     <w:p>
@@ -1131,7 +1077,7 @@
         <w:t xml:space="preserve">  3a. </w:t>
       </w:r>
       <w:r>
-        <w:t>Si és un torn de diumenge nit i hi ha pendent una guàrdia d'un sun-nit-only, s'assigna allà.</w:t>
+        <w:t>Diumenge nit + sun-nit-only pendent → assignar-l'hi.</w:t>
       </w:r>
     </w:p>
     <w:p>
@@ -1145,7 +1091,7 @@
         <w:t xml:space="preserve">  3b. </w:t>
       </w:r>
       <w:r>
-        <w:t>Si és Sat/Sun dia i hi ha pendent una guàrdia d'un weekend-day-only, s'assigna allà.</w:t>
+        <w:t>Sat/Sun dia + weekend-day-only pendent → assignar-l'hi.</w:t>
       </w:r>
     </w:p>
     <w:p>
@@ -1159,7 +1105,21 @@
         <w:t xml:space="preserve">  3c. </w:t>
       </w:r>
       <w:r>
-        <w:t>Altrament, s'agafa el primer de la cua. Si és sun-nit-only o weekend-day-only, s'incrementa el seu comptador de pendents i passa al següent. Si pot treballar aquell dia (sense V/C/G ni G adjacent) i no té ja un torn aquell dia, s'assigna. Si no pot, queda al davant de la cua per al pròxim torn.</w:t>
+        <w:t>Dimecres 16-20 (excepte 1r del mes) → si hi ha nou-incorporats disponibles, assignar el següent de la cua nou-incorporats.</w:t>
+      </w:r>
+    </w:p>
+    <w:p>
+      <w:pPr>
+        <w:pStyle w:val="ListNumber"/>
+      </w:pPr>
+      <w:r>
+        <w:rPr>
+          <w:b/>
+        </w:rPr>
+        <w:t xml:space="preserve">  3d. </w:t>
+      </w:r>
+      <w:r>
+        <w:t>Altrament, cua alfabètica general. Els sun-nit-only/weekend-day-only que hi apareixen s'ajornen.</w:t>
       </w:r>
     </w:p>
     <w:p>
@@ -1173,7 +1133,7 @@
         <w:t xml:space="preserve">Cua circular. </w:t>
       </w:r>
       <w:r>
-        <w:t>Quan una persona se li assigna un torn, va al final de la cua. Quan ha passat per tothom, la roda continua amb una segona volta.</w:t>
+        <w:t>Assignat = va al final de la cua.</w:t>
       </w:r>
     </w:p>
     <w:p>
@@ -1187,7 +1147,7 @@
         <w:t xml:space="preserve">Equitat. </w:t>
       </w:r>
       <w:r>
-        <w:t>L'algorisme garanteix que tots els rotadors purs facin la primera guàrdia abans que ningú no faci la segona.</w:t>
+        <w:t>Tots els rotadors purs fan la 1a guàrdia abans que ningú faci la 2a.</w:t>
       </w:r>
     </w:p>
     <w:p>
@@ -1203,7 +1163,7 @@
         <w:pStyle w:val="ListBullet"/>
       </w:pPr>
       <w:r>
-        <w:t>Cap professional té dues guàrdies el mateix dia.</w:t>
+        <w:t>Cap doble assignació per dia.</w:t>
       </w:r>
     </w:p>
     <w:p>
@@ -1211,7 +1171,7 @@
         <w:pStyle w:val="ListBullet"/>
       </w:pPr>
       <w:r>
-        <w:t>Cap guàrdia cau en V, C o G del professional.</w:t>
+        <w:t>Cap V/C/G violat.</w:t>
       </w:r>
     </w:p>
     <w:p>
@@ -1219,7 +1179,7 @@
         <w:pStyle w:val="ListBullet"/>
       </w:pPr>
       <w:r>
-        <w:t>Cap guàrdia cau el dia anterior o posterior a una G del professional.</w:t>
+        <w:t>Cap guàrdia el dia anterior o posterior a una G.</w:t>
       </w:r>
     </w:p>
     <w:p>
@@ -1227,7 +1187,7 @@
         <w:pStyle w:val="ListBullet"/>
       </w:pPr>
       <w:r>
-        <w:t>Els sun-nit-only només apareixen a Dg nit.</w:t>
+        <w:t>Els sun-nit-only només a Dg nit.</w:t>
       </w:r>
     </w:p>
     <w:p>
@@ -1235,7 +1195,7 @@
         <w:pStyle w:val="ListBullet"/>
       </w:pPr>
       <w:r>
-        <w:t>Els weekend-day-only només apareixen a Ds/Dg dia.</w:t>
+        <w:t>Els weekend-day-only només a Ds/Dg dia.</w:t>
       </w:r>
     </w:p>
     <w:p>
@@ -1243,7 +1203,7 @@
         <w:pStyle w:val="ListBullet"/>
       </w:pPr>
       <w:r>
-        <w:t>Tots els torns rotatoris estan coberts.</w:t>
+        <w:t>Els nou-incorporats només a Dc 16-20 (excloent 1r Dc del mes).</w:t>
       </w:r>
     </w:p>
     <w:p>
@@ -1251,7 +1211,7 @@
         <w:pStyle w:val="ListBullet"/>
       </w:pPr>
       <w:r>
-        <w:t>La distribució entre rotadors purs és aproximadament equitativa (diferència màx-mín ≤ 1).</w:t>
+        <w:t>Distribució equitativa entre rotadors purs (diferència màx-mín ≤ 1).</w:t>
       </w:r>
     </w:p>
     <w:p>
@@ -1264,12 +1224,12 @@
     </w:p>
     <w:p>
       <w:r>
-        <w:t>Quan entra o surt un professional, vegeu el document `06_Proces_Altes_Baixes.md`.</w:t>
+        <w:t>Quan entra o surt un professional, vegeu `06_Proces_Altes_Baixes.md`.</w:t>
       </w:r>
     </w:p>
     <w:p>
       <w:r>
-        <w:t>Si canvia una regla estructural (p. ex. un torn fix passa a anar per roda, o canvia el rol d'un perfil), només cal editar la pestanya "Configuració" del fitxer d'entrada. El codi no requereix canvis.</w:t>
+        <w:t>Cas típic d'incorporació nova: afegir el professional a la pestanya Radiòlegs amb rol "nou-incorporat". Cobrirà dimecres 16-20 durant el període de rodatge. Quan la Direcció TD ho consideri, canviar el rol a "rotador" i entrarà a la roda general.</w:t>
       </w:r>
     </w:p>
     <w:p>
@@ -1288,7 +1248,7 @@
         <w:rPr>
           <w:color w:val="C0392B"/>
         </w:rPr>
-        <w:t>Cadència dels professionals "sun-nit-only" — el model actual els assigna quan li toca per roda; si voleu una cadència fixa (p. ex. cada 14 dies), cal documentar-la i adaptar l'algorisme.</w:t>
+        <w:t>Cadència dels sun-nit-only — actualment segueixen la roda; si voleu una cadència fixa, cal documentar-la.</w:t>
       </w:r>
     </w:p>
     <w:p>
@@ -1299,7 +1259,7 @@
         <w:rPr>
           <w:color w:val="C0392B"/>
         </w:rPr>
-        <w:t>Composició dels grups en festius dj/dv — cada grup cobreix uns hospitals concrets. Aquesta llista no és part de l'algorisme actual; si afecta l'assignació, cal afegir-ho a la configuració.</w:t>
+        <w:t>Composició de grups a festius dj/dv — si la definició d'hospitals per grup afecta l'assignació, cal afegir-ho a Configuració.</w:t>
       </w:r>
     </w:p>
     <w:p>
@@ -1310,7 +1270,18 @@
         <w:rPr>
           <w:color w:val="C0392B"/>
         </w:rPr>
-        <w:t>Política de substitucions quan un fix té V/C/G — actualment el sistema marca el torn per substituir manualment; es pot automatitzar amb una llista de substituts a la Configuració.</w:t>
+        <w:t>Política de substitucions per V/C/G d'un fix — actualment marca [SUBSTITUIR] al planning; es pot automatitzar.</w:t>
+      </w:r>
+    </w:p>
+    <w:p>
+      <w:pPr>
+        <w:pStyle w:val="ListBullet"/>
+      </w:pPr>
+      <w:r>
+        <w:rPr>
+          <w:color w:val="C0392B"/>
+        </w:rPr>
+        <w:t>Durada del període "nou-incorporat" — quant dura, típicament? Qui decideix quan es promou a "rotador"? Documentar el criteri.</w:t>
       </w:r>
     </w:p>
     <w:sectPr>

</xml_diff>